<commit_message>
Add DOIs to references (IOP Vancouver style) per IOP reference-styling note
- Append verified DOIs to 14/15 refs (Crossref-verified)
- Fix ref [14] Satar pages to 162-7 (was 1-6)
- Flag ref [9] GJESM DOI for manual entry (not Crossref-indexed)
- Regenerate DOCX
</commit_message>
<xml_diff>
--- a/research-map/Paper-Tofu-Final-IOP-EES.docx
+++ b/research-map/Paper-Tofu-Final-IOP-EES.docx
@@ -7563,7 +7563,7 @@
           <w:rFonts w:ascii="Times New Roman" w:hAnsi="Times New Roman"/>
           <w:sz w:val="20"/>
         </w:rPr>
-        <w:t>[1] Badan Pusat Statistik 2026 Rata-Rata Konsumsi per Kapita Seminggu Beberapa Macam Bahan Makanan Penting 2007–2025 (Jakarta: Badan Pusat Statistik)</w:t>
+        <w:t>[1] Badan Pusat Statistik 2026 Rata-Rata Konsumsi per Kapita Seminggu Beberapa Macam Bahan Makanan Penting 2007–2025 (Jakarta: Badan Pusat Statistik) Available at: https://www.bps.go.id</w:t>
       </w:r>
     </w:p>
     <w:p>
@@ -7577,7 +7577,7 @@
           <w:rFonts w:ascii="Times New Roman" w:hAnsi="Times New Roman"/>
           <w:sz w:val="20"/>
         </w:rPr>
-        <w:t>[2] Seroja R, Effendi H and Hariyadi S 2018 Tofu wastewater treatment using vetiver grass (Vetiveria zizanioides) and zeliac Appl. Water Sci. 8 2</w:t>
+        <w:t>[2] Seroja R, Effendi H and Hariyadi S 2018 Tofu wastewater treatment using vetiver grass (Vetiveria zizanioides) and zeliac Appl. Water Sci. 8 2 https://doi.org/10.1007/s13201-018-0640-y</w:t>
       </w:r>
     </w:p>
     <w:p>
@@ -7591,7 +7591,7 @@
           <w:rFonts w:ascii="Times New Roman" w:hAnsi="Times New Roman"/>
           <w:sz w:val="20"/>
         </w:rPr>
-        <w:t>[3] Sjafruddin R, Agustang A and Pertiwi N 2022 Estimasi limbah industri tahu dan kajian penerapan sistem produksi bersih J. Ilm. Mandala Educ. 8 1229–37</w:t>
+        <w:t>[3] Sjafruddin R, Agustang A and Pertiwi N 2022 Estimasi limbah industri tahu dan kajian penerapan sistem produksi bersih J. Ilm. Mandala Educ. 8 1229–37 https://doi.org/10.36312/jime.v8i2.2826</w:t>
       </w:r>
     </w:p>
     <w:p>
@@ -7605,7 +7605,7 @@
           <w:rFonts w:ascii="Times New Roman" w:hAnsi="Times New Roman"/>
           <w:sz w:val="20"/>
         </w:rPr>
-        <w:t>[4] Basuki T M, Nugroho H Y S H, Indrajaya Y, Pramono I B, Nugroho N P, Supangat A B et al. 2024 Water pollution of some major rivers in Indonesia: status, institution, regulation, and recommendation for mitigation Pol. J. Environ. Stud. 33 3515–30</w:t>
+        <w:t>[4] Basuki T M, Nugroho H Y S H, Indrajaya Y, Pramono I B, Nugroho N P, Supangat A B et al. 2024 Water pollution of some major rivers in Indonesia: status, institution, regulation, and recommendation for mitigation Pol. J. Environ. Stud. 33 3515–30 https://doi.org/10.15244/pjoes/178532</w:t>
       </w:r>
     </w:p>
     <w:p>
@@ -7619,7 +7619,7 @@
           <w:rFonts w:ascii="Times New Roman" w:hAnsi="Times New Roman"/>
           <w:sz w:val="20"/>
         </w:rPr>
-        <w:t>[5] Chitaka T Y and Goga T 2023 The evolution of life cycle assessment in the food and beverage industry: a review Cambridge Prisms: Plast. 1 e2</w:t>
+        <w:t>[5] Chitaka T Y and Goga T 2023 The evolution of life cycle assessment in the food and beverage industry: a review Cambridge Prisms: Plast. 1 e2 https://doi.org/10.1017/plc.2023.4</w:t>
       </w:r>
     </w:p>
     <w:p>
@@ -7633,7 +7633,7 @@
           <w:rFonts w:ascii="Times New Roman" w:hAnsi="Times New Roman"/>
           <w:sz w:val="20"/>
         </w:rPr>
-        <w:t>[6] Rosyidah M, Masruri A and Putra R A 2020 Analysis of environmental impact with the Life Cycle Assessment (LCA) method on tofu production Int. J. Sci. Technol. Manag. 1 428–35</w:t>
+        <w:t>[6] Rosyidah M, Masruri A and Putra R A 2020 Analysis of environmental impact with the Life Cycle Assessment (LCA) method on tofu production Int. J. Sci. Technol. Manag. 1 428–35 https://doi.org/10.46729/ijstm.v1i4.73</w:t>
       </w:r>
     </w:p>
     <w:p>
@@ -7647,7 +7647,7 @@
           <w:rFonts w:ascii="Times New Roman" w:hAnsi="Times New Roman"/>
           <w:sz w:val="20"/>
         </w:rPr>
-        <w:t>[7] Nugroho M E, Setyono P and Rachmawati S 2024 Analisis emisi gas rumah kaca dengan Life Cycle Assessment (LCA) dan Analytical Hierarchy Process (AHP) industri tahu J. Ilmu Lingkung. 22 1504–12</w:t>
+        <w:t>[7] Nugroho M E, Setyono P and Rachmawati S 2024 Analisis emisi gas rumah kaca dengan Life Cycle Assessment (LCA) dan Analytical Hierarchy Process (AHP) industri tahu J. Ilmu Lingkung. 22 1504–12 https://doi.org/10.14710/jil.22.6.1504-1512</w:t>
       </w:r>
     </w:p>
     <w:p>
@@ -7661,7 +7661,7 @@
           <w:rFonts w:ascii="Times New Roman" w:hAnsi="Times New Roman"/>
           <w:sz w:val="20"/>
         </w:rPr>
-        <w:t>[8] Sari I P, Kurniawan W and Sia F L 2021 Environmental impact of tofu production in West Jakarta using a life cycle assessment approach IOP Conf. Ser.: Earth Environ. Sci. 896 012050</w:t>
+        <w:t>[8] Sari I P, Kurniawan W and Sia F L 2021 Environmental impact of tofu production in West Jakarta using a life cycle assessment approach IOP Conf. Ser.: Earth Environ. Sci. 896 012050 https://doi.org/10.1088/1755-1315/896/1/012050</w:t>
       </w:r>
     </w:p>
     <w:p>
@@ -7675,7 +7675,7 @@
           <w:rFonts w:ascii="Times New Roman" w:hAnsi="Times New Roman"/>
           <w:sz w:val="20"/>
         </w:rPr>
-        <w:t>[9] Hartini S, Fatliana A N, Handayani N U, Wicaksono P A, Ramadan B S and Matsumoto T 2024 Life cycle assessment and life cycle cost of tofu production and its extended recycling scenario Glob. J. Environ. Sci. Manag. 10 487–504</w:t>
+        <w:t>[9] Hartini S, Fatliana A N, Handayani N U, Wicaksono P A, Ramadan B S and Matsumoto T 2024 Life cycle assessment and life cycle cost of tofu production and its extended recycling scenario Glob. J. Environ. Sci. Manag. 10 487 [DOI: add from published version, prefix 10.22034/gjesm]</w:t>
       </w:r>
     </w:p>
     <w:p>
@@ -7689,7 +7689,7 @@
           <w:rFonts w:ascii="Times New Roman" w:hAnsi="Times New Roman"/>
           <w:sz w:val="20"/>
         </w:rPr>
-        <w:t>[10] Kartika Wardana S, Cucikodana Y, Almaniar S, Dwijayanti A, Maulana F and Muhlisoh N A 2024 Penilaian dampak lingkungan dengan menggunakan Life Cycle Assessment (LCA) pada industri tahu Kampung Jangkar Kulon, Cilegon Banten J. Teknol. Kim. Unimal 13 97–106</w:t>
+        <w:t>[10] Kartika Wardana S, Cucikodana Y, Almaniar S, Dwijayanti A, Maulana F and Muhlisoh N A 2024 Penilaian dampak lingkungan dengan menggunakan Life Cycle Assessment (LCA) pada industri tahu Kampung Jangkar Kulon, Cilegon Banten J. Teknol. Kim. Unimal 13 97–106 https://doi.org/10.29103/jtku.v13i2.16429</w:t>
       </w:r>
     </w:p>
     <w:p>
@@ -7703,7 +7703,7 @@
           <w:rFonts w:ascii="Times New Roman" w:hAnsi="Times New Roman"/>
           <w:sz w:val="20"/>
         </w:rPr>
-        <w:t>[11] Mir B A, Nurdiawati A and Al-Ghamdi S G 2025 Assessing the environmental impact of freshwater use in LCA: established practices and current methods Environ. Sci.: Water Res. Technol. 11 196–221</w:t>
+        <w:t>[11] Mir B A, Nurdiawati A and Al-Ghamdi S G 2025 Assessing the environmental impact of freshwater use in LCA: established practices and current methods Environ. Sci.: Water Res. Technol. 11 196–221 https://doi.org/10.1039/D4EW00641K</w:t>
       </w:r>
     </w:p>
     <w:p>
@@ -7717,7 +7717,7 @@
           <w:rFonts w:ascii="Times New Roman" w:hAnsi="Times New Roman"/>
           <w:sz w:val="20"/>
         </w:rPr>
-        <w:t>[12] Saavedra-Rubio K, Thonemann N, Crenna E, Lemoine B, Caliandro P and Laurent A 2022 Stepwise guidance for data collection in the life cycle inventory (LCI) phase: building technology-related LCI blocks J. Clean. Prod. 366 132903</w:t>
+        <w:t>[12] Saavedra-Rubio K, Thonemann N, Crenna E, Lemoine B, Caliandro P and Laurent A 2022 Stepwise guidance for data collection in the life cycle inventory (LCI) phase: building technology-related LCI blocks J. Clean. Prod. 366 132903 https://doi.org/10.1016/j.jclepro.2022.132903</w:t>
       </w:r>
     </w:p>
     <w:p>
@@ -7731,7 +7731,7 @@
           <w:rFonts w:ascii="Times New Roman" w:hAnsi="Times New Roman"/>
           <w:sz w:val="20"/>
         </w:rPr>
-        <w:t>[13] Bjørnbet M M and Vildåsen S S 2021 Life cycle assessment to ensure sustainability of circular business models in manufacturing Sustainability 13 11014</w:t>
+        <w:t>[13] Bjørnbet M M and Vildåsen S S 2021 Life cycle assessment to ensure sustainability of circular business models in manufacturing Sustainability 13 11014 https://doi.org/10.3390/su131911014</w:t>
       </w:r>
     </w:p>
     <w:p>
@@ -7745,7 +7745,7 @@
           <w:rFonts w:ascii="Times New Roman" w:hAnsi="Times New Roman"/>
           <w:sz w:val="20"/>
         </w:rPr>
-        <w:t>[14] Satar I and Permadi A 2022 Treating the tofu wastewater (TWW) using a green technology of microbial fuel cell (MFC) system Indones. J. Environ. Manag. Sustain. 6 1–6</w:t>
+        <w:t>[14] Satar I and Permadi A 2022 Treating the tofu wastewater (TWW) using a green technology of microbial fuel cell (MFC) system Indones. J. Environ. Manag. Sustain. 6 162–7 https://doi.org/10.26554/ijems.2022.6.1.162-167</w:t>
       </w:r>
     </w:p>
     <w:p>
@@ -7759,7 +7759,7 @@
           <w:rFonts w:ascii="Times New Roman" w:hAnsi="Times New Roman"/>
           <w:sz w:val="20"/>
         </w:rPr>
-        <w:t>[15] Ningsih L M, Mazancová J, Hasanudin U and Roubík H 2026 Energy audits in the tofu industry: an evaluation of energy consumption towards a green and sustainable industry Environ. Dev. Sustain. 28 3737–59</w:t>
+        <w:t>[15] Ningsih L M, Mazancová J, Hasanudin U and Roubík H 2026 Energy audits in the tofu industry: an evaluation of energy consumption towards a green and sustainable industry Environ. Dev. Sustain. 28 3737–59 https://doi.org/10.1007/s10668-024-05109-z</w:t>
       </w:r>
     </w:p>
     <w:sectPr>

</xml_diff>

<commit_message>
Refine Results & Discussion: merge best of both source versions
- Add prior-study comparison (~98% CO2-eq from wood-fired boiling)
- Add full per-stage AWARE water-scarcity figures (all 6 stages)
- Add closing synthesis paragraph (source reduction vs end-of-pipe, ISO 14040/14044 hierarchy)
- Regenerate DOCX
</commit_message>
<xml_diff>
--- a/research-map/Paper-Tofu-Final-IOP-EES.docx
+++ b/research-map/Paper-Tofu-Final-IOP-EES.docx
@@ -492,7 +492,7 @@
           <w:i w:val="0"/>
           <w:sz w:val="22"/>
         </w:rPr>
-        <w:t xml:space="preserve"> Total GWP is 5.28 × 10³ kg CO₂ eq. The washing stage is the largest contributor at 3.56 × 10³ kg CO₂ eq (≈67.4%), followed by boiling at 1.63 × 10³ kg CO₂ eq (≈30.9%). The dominance of washing is mechanistically driven by the large volume of water consumed (2,800 L per batch; Table 1), which is linked within the LCA framework to energy-intensive upstream water extraction, treatment, and distribution that generate indirect emissions [5]. In addition, organic-laden washing wastewater can generate methane (CH₄) under anaerobic decomposition if discharged untreated [2]. Boiling contributes substantially through the direct combustion of 800 kg of firewood per batch, releasing CO₂, CH₄, and N₂O—consistent with comparative LCA studies of wood-fired tofu production in Indonesia, where boiling was identified as the primary emission source [6].</w:t>
+        <w:t xml:space="preserve"> Total GWP is 5.28 × 10³ kg CO₂ eq. The washing stage is the largest contributor at 3.56 × 10³ kg CO₂ eq (≈67.4%), followed by boiling at 1.63 × 10³ kg CO₂ eq (≈30.9%). The dominance of washing is mechanistically driven by the large volume of water consumed (2,800 L per batch; Table 1), which is linked within the LCA framework to energy-intensive upstream water extraction, treatment, and distribution that generate indirect emissions [5]. In addition, organic-laden washing wastewater can generate methane (CH₄) under anaerobic decomposition if discharged untreated [2]. Boiling contributes substantially through the direct combustion of 800 kg of firewood per batch, releasing CO₂, CH₄, and N₂O—consistent with comparative LCA studies of wood-fired tofu production in Indonesia, where boiling was identified as the primary emission source, accounting for up to ~98% of total CO₂-equivalent emissions in some production configurations [6].</w:t>
       </w:r>
     </w:p>
     <w:p>
@@ -618,7 +618,7 @@
           <w:i w:val="0"/>
           <w:sz w:val="22"/>
         </w:rPr>
-        <w:t>Water use was assessed with the AWARE method, which expresses the volume of water deprived from downstream users per unit consumed at a given location. The total water-scarcity impact of the production system is 515 m³ world eq (Table 3). Contrary to the pattern in the CML-IA categories, the boiling stage is the dominant contributor at 294 m³ world eq (≈57.1%), rather than washing. This reflects the AWARE method's sensitivity to upstream supply-chain water consumption: firewood procurement, processing, and distribution embed substantial water use that is allocated back to boiling, elevating its scarcity value beyond what direct water consumption alone would suggest [11]. Grinding contributes the second-largest share (101 m³ world eq; ≈19.6%), consistent with the continuous water addition required to achieve appropriate slurry consistency (4,200 L; Table 1). The comparatively lower scarcity value of washing—despite generating the largest effluent volume—illustrates that water-scarcity characterization is governed not solely by effluent volume but by regional water availability and the embedded water footprint of upstream inputs [11].</w:t>
+        <w:t>Water use was assessed with the AWARE method, which expresses the volume of water deprived from downstream users per unit consumed at a given location. The total water-scarcity impact of the production system is 515 m³ world eq (Table 3). Contrary to the pattern in the CML-IA categories, the boiling stage is the dominant contributor at 294 m³ world eq (≈57.1%), rather than washing. This reflects the AWARE method's sensitivity to upstream supply-chain water consumption: firewood procurement, processing, and distribution embed substantial water use that is allocated back to boiling, elevating its scarcity value beyond what direct water consumption alone would suggest [11]. Grinding contributes the second-largest share (101 m³ world eq; ≈19.6%), consistent with the continuous water addition required to achieve appropriate slurry consistency (4,200 L; Table 1). The soaking, coagulation, and washing stages contribute 39.3, 38.2, and 35.8 m³ world eq (≈7.6%, 7.4%, and 7.0%, respectively), and molding and packaging the least (7.63 m³ world eq; ≈1.5%). The comparatively lower scarcity value of washing—despite generating the largest effluent volume—illustrates that water-scarcity characterization is governed not solely by effluent volume but by regional water availability and the embedded water footprint of upstream inputs [11].</w:t>
       </w:r>
     </w:p>
     <w:p>
@@ -724,6 +724,21 @@
           <w:sz w:val="22"/>
         </w:rPr>
         <w:t>For the second hotspot, boiling contributes disproportionately to GWP and water scarcity owing to its reliance on firewood: combustion of 800 kg per batch releases 1,397 kg CO₂, 0.0499 kg CH₄, and 0.3744 kg N₂O. Transitioning to cleaner energy—such as LPG or biomethane recovered from on-site biodigesters—would directly reduce these emissions while lowering the upstream water footprint embedded in the firewood supply chain [15]. Adopting improved-combustion or thermally insulated boiling systems, together with waste-heat recovery to pre-heat process water, would further reduce specific fuel consumption [15]. Overall, the LCA evidence demonstrates that interventions targeting liquid-waste management and energy efficiency at the source yield substantially greater environmental benefit than conventional end-of-pipe approaches [13].</w:t>
+      </w:r>
+    </w:p>
+    <w:p>
+      <w:pPr>
+        <w:spacing w:before="0" w:after="120" w:line="276" w:lineRule="auto"/>
+        <w:jc w:val="both"/>
+      </w:pPr>
+      <w:r>
+        <w:rPr>
+          <w:rFonts w:ascii="Times New Roman" w:hAnsi="Times New Roman"/>
+          <w:b w:val="0"/>
+          <w:i w:val="0"/>
+          <w:sz w:val="22"/>
+        </w:rPr>
+        <w:t>Taken together, the disproportionate contribution of the washing stage to FAET, GWP, acidification, and eutrophication—evidenced consistently across Tables 2 and 4 and Figure 2—indicates that process-level modifications at the earliest stages of the production chain deliver the greatest systemic environmental benefit. This conclusion is consistent with the waste-reduction hierarchy embedded in the ISO 14040/14044 framework [5] and with circular-production principles that prioritize source reduction and resource recovery over end-of-pipe control [13].</w:t>
       </w:r>
     </w:p>
     <w:p>

</xml_diff>

<commit_message>
Remove ref [14] Satar; renumber to 14 references total
- Delete Satar (MFC) reference per request
- Old [15] Ningsih -> new [14]; update in-text citations
- Re-point wastewater/recycling citations to [2] Seroja and [3] Sjafruddin
- Regenerate DOCX; verified [1]-[14] consistent
</commit_message>
<xml_diff>
--- a/research-map/Paper-Tofu-Final-IOP-EES.docx
+++ b/research-map/Paper-Tofu-Final-IOP-EES.docx
@@ -708,7 +708,7 @@
           <w:i w:val="0"/>
           <w:sz w:val="22"/>
         </w:rPr>
-        <w:t>For the first hotspot, the high-BOD/COD, nutrient-rich effluents from washing, soaking, and coagulation pose significant risks to receiving ecosystems if discharged untreated [2, 3]. Anaerobic treatment (e.g., biodigesters or integrated biogas wastewater units) is technically appropriate for SME-scale operations because it reduces organic loading while recovering biogas as an energy resource, simultaneously lowering FAET (through effluent-load reduction) and GWP (through fuel displacement) [2, 14]. Complementary measures include constructed-wetland or biofilter polishing for nutrient removal, counter-current water recycling within washing and soaking to cut both water consumption and effluent generation, and valorization of whey as a protein-rich feed or fermentation substrate to divert high-nutrient streams away from treatment [13].</w:t>
+        <w:t>For the first hotspot, the high-BOD/COD, nutrient-rich effluents from washing, soaking, and coagulation pose significant risks to receiving ecosystems if discharged untreated [2, 3]. Anaerobic treatment (e.g., biodigesters or integrated biogas wastewater units) is technically appropriate for SME-scale operations because it reduces organic loading while recovering biogas as an energy resource, simultaneously lowering FAET (through effluent-load reduction) and GWP (through fuel displacement) [2]. Complementary measures include constructed-wetland or biofilter polishing for nutrient removal, counter-current water recycling within washing and soaking to cut both water consumption and effluent generation, and valorization of whey as a protein-rich feed or fermentation substrate to divert high-nutrient streams away from treatment [13].</w:t>
       </w:r>
     </w:p>
     <w:p>
@@ -723,7 +723,7 @@
           <w:i w:val="0"/>
           <w:sz w:val="22"/>
         </w:rPr>
-        <w:t>For the second hotspot, boiling contributes disproportionately to GWP and water scarcity owing to its reliance on firewood: combustion of 800 kg per batch releases 1,397 kg CO₂, 0.0499 kg CH₄, and 0.3744 kg N₂O. Transitioning to cleaner energy—such as LPG or biomethane recovered from on-site biodigesters—would directly reduce these emissions while lowering the upstream water footprint embedded in the firewood supply chain [15]. Adopting improved-combustion or thermally insulated boiling systems, together with waste-heat recovery to pre-heat process water, would further reduce specific fuel consumption [15]. Overall, the LCA evidence demonstrates that interventions targeting liquid-waste management and energy efficiency at the source yield substantially greater environmental benefit than conventional end-of-pipe approaches [13].</w:t>
+        <w:t>For the second hotspot, boiling contributes disproportionately to GWP and water scarcity owing to its reliance on firewood: combustion of 800 kg per batch releases 1,397 kg CO₂, 0.0499 kg CH₄, and 0.3744 kg N₂O. Transitioning to cleaner energy—such as LPG or biomethane recovered from on-site biodigesters—would directly reduce these emissions while lowering the upstream water footprint embedded in the firewood supply chain [14]. Adopting improved-combustion or thermally insulated boiling systems, together with waste-heat recovery to pre-heat process water, would further reduce specific fuel consumption [14]. Overall, the LCA evidence demonstrates that interventions targeting liquid-waste management and energy efficiency at the source yield substantially greater environmental benefit than conventional end-of-pipe approaches [13].</w:t>
       </w:r>
     </w:p>
     <w:p>
@@ -7371,7 +7371,7 @@
                 <w:rFonts w:ascii="Times New Roman" w:hAnsi="Times New Roman"/>
                 <w:sz w:val="18"/>
               </w:rPr>
-              <w:t>[2, 14]</w:t>
+              <w:t>[2]</w:t>
             </w:r>
           </w:p>
         </w:tc>
@@ -7451,7 +7451,7 @@
                 <w:rFonts w:ascii="Times New Roman" w:hAnsi="Times New Roman"/>
                 <w:sz w:val="18"/>
               </w:rPr>
-              <w:t>[14]</w:t>
+              <w:t>[3]</w:t>
             </w:r>
           </w:p>
         </w:tc>
@@ -7531,7 +7531,7 @@
                 <w:rFonts w:ascii="Times New Roman" w:hAnsi="Times New Roman"/>
                 <w:sz w:val="18"/>
               </w:rPr>
-              <w:t>[15]</w:t>
+              <w:t>[14]</w:t>
             </w:r>
           </w:p>
         </w:tc>
@@ -7760,21 +7760,7 @@
           <w:rFonts w:ascii="Times New Roman" w:hAnsi="Times New Roman"/>
           <w:sz w:val="20"/>
         </w:rPr>
-        <w:t>[14] Satar I and Permadi A 2022 Treating the tofu wastewater (TWW) using a green technology of microbial fuel cell (MFC) system Indones. J. Environ. Manag. Sustain. 6 162–7 https://doi.org/10.26554/ijems.2022.6.1.162-167</w:t>
-      </w:r>
-    </w:p>
-    <w:p>
-      <w:pPr>
-        <w:spacing w:before="0" w:after="60" w:line="240" w:lineRule="auto"/>
-        <w:ind w:left="425" w:hanging="425"/>
-        <w:jc w:val="both"/>
-      </w:pPr>
-      <w:r>
-        <w:rPr>
-          <w:rFonts w:ascii="Times New Roman" w:hAnsi="Times New Roman"/>
-          <w:sz w:val="20"/>
-        </w:rPr>
-        <w:t>[15] Ningsih L M, Mazancová J, Hasanudin U and Roubík H 2026 Energy audits in the tofu industry: an evaluation of energy consumption towards a green and sustainable industry Environ. Dev. Sustain. 28 3737–59 https://doi.org/10.1007/s10668-024-05109-z</w:t>
+        <w:t>[14] Ningsih L M, Mazancová J, Hasanudin U and Roubík H 2026 Energy audits in the tofu industry: an evaluation of energy consumption towards a green and sustainable industry Environ. Dev. Sustain. 28 3737–59 https://doi.org/10.1007/s10668-024-05109-z</w:t>
       </w:r>
     </w:p>
     <w:sectPr>

</xml_diff>